<commit_message>
Add Book of the Month with Solid and The Meaning of Marriage.
Co-authored-by: Cursor <cursoragent@cursor.com>
</commit_message>
<xml_diff>
--- a/scripts/Announcement-Script-2026-09-13.docx
+++ b/scripts/Announcement-Script-2026-09-13.docx
@@ -371,6 +371,168 @@
           <w:sz w:val="22"/>
         </w:rPr>
         <w:t>Delight</w:t>
+      </w:r>
+      <w:r>
+        <w:rPr>
+          <w:rFonts w:ascii="Arial" w:hAnsi="Arial" w:eastAsia="Arial"/>
+          <w:b w:val="0"/>
+          <w:color w:val="000000"/>
+          <w:sz w:val="22"/>
+        </w:rPr>
+        <w:t>.</w:t>
+      </w:r>
+    </w:p>
+    <w:p>
+      <w:pPr>
+        <w:spacing w:before="40" w:after="40"/>
+      </w:pPr>
+      <w:r>
+        <w:rPr>
+          <w:rFonts w:ascii="Arial" w:hAnsi="Arial" w:eastAsia="Arial"/>
+          <w:color w:val="BFBFBF"/>
+          <w:sz w:val="16"/>
+        </w:rPr>
+        <w:t>────────────────────────────────────────────────────────────────────────</w:t>
+      </w:r>
+    </w:p>
+    <w:p>
+      <w:pPr>
+        <w:spacing w:before="200" w:after="120" w:line="240" w:lineRule="auto"/>
+      </w:pPr>
+      <w:r>
+        <w:rPr>
+          <w:rFonts w:ascii="Arial" w:hAnsi="Arial" w:eastAsia="Arial"/>
+          <w:b/>
+          <w:color w:val="C00000"/>
+          <w:sz w:val="22"/>
+        </w:rPr>
+        <w:t>Book of the Month:</w:t>
+      </w:r>
+      <w:r>
+        <w:rPr>
+          <w:rFonts w:ascii="Arial" w:hAnsi="Arial" w:eastAsia="Arial"/>
+          <w:b w:val="0"/>
+          <w:color w:val="000000"/>
+          <w:sz w:val="22"/>
+        </w:rPr>
+        <w:t xml:space="preserve"> We're reading two books this month — </w:t>
+      </w:r>
+      <w:r>
+        <w:rPr>
+          <w:rFonts w:ascii="Arial" w:hAnsi="Arial" w:eastAsia="Arial"/>
+          <w:b/>
+          <w:color w:val="C00000"/>
+          <w:sz w:val="22"/>
+        </w:rPr>
+        <w:t>Solid</w:t>
+      </w:r>
+      <w:r>
+        <w:rPr>
+          <w:rFonts w:ascii="Arial" w:hAnsi="Arial" w:eastAsia="Arial"/>
+          <w:b w:val="0"/>
+          <w:color w:val="000000"/>
+          <w:sz w:val="22"/>
+        </w:rPr>
+        <w:t xml:space="preserve"> by Pastor </w:t>
+      </w:r>
+      <w:r>
+        <w:rPr>
+          <w:rFonts w:ascii="Arial" w:hAnsi="Arial" w:eastAsia="Arial"/>
+          <w:b/>
+          <w:color w:val="C00000"/>
+          <w:sz w:val="22"/>
+        </w:rPr>
+        <w:t>Godman Akinlabi</w:t>
+      </w:r>
+      <w:r>
+        <w:rPr>
+          <w:rFonts w:ascii="Arial" w:hAnsi="Arial" w:eastAsia="Arial"/>
+          <w:b w:val="0"/>
+          <w:color w:val="000000"/>
+          <w:sz w:val="22"/>
+        </w:rPr>
+        <w:t xml:space="preserve">, and </w:t>
+      </w:r>
+      <w:r>
+        <w:rPr>
+          <w:rFonts w:ascii="Arial" w:hAnsi="Arial" w:eastAsia="Arial"/>
+          <w:b/>
+          <w:color w:val="C00000"/>
+          <w:sz w:val="22"/>
+        </w:rPr>
+        <w:t>The Meaning of Marriage</w:t>
+      </w:r>
+      <w:r>
+        <w:rPr>
+          <w:rFonts w:ascii="Arial" w:hAnsi="Arial" w:eastAsia="Arial"/>
+          <w:b w:val="0"/>
+          <w:color w:val="000000"/>
+          <w:sz w:val="22"/>
+        </w:rPr>
+        <w:t xml:space="preserve"> by </w:t>
+      </w:r>
+      <w:r>
+        <w:rPr>
+          <w:rFonts w:ascii="Arial" w:hAnsi="Arial" w:eastAsia="Arial"/>
+          <w:b/>
+          <w:color w:val="C00000"/>
+          <w:sz w:val="22"/>
+        </w:rPr>
+        <w:t>Timothy Keller</w:t>
+      </w:r>
+      <w:r>
+        <w:rPr>
+          <w:rFonts w:ascii="Arial" w:hAnsi="Arial" w:eastAsia="Arial"/>
+          <w:b w:val="0"/>
+          <w:color w:val="000000"/>
+          <w:sz w:val="22"/>
+        </w:rPr>
+        <w:t xml:space="preserve">. It runs </w:t>
+      </w:r>
+      <w:r>
+        <w:rPr>
+          <w:rFonts w:ascii="Arial" w:hAnsi="Arial" w:eastAsia="Arial"/>
+          <w:b/>
+          <w:color w:val="C00000"/>
+          <w:sz w:val="22"/>
+        </w:rPr>
+        <w:t>7th September to 2nd October</w:t>
+      </w:r>
+      <w:r>
+        <w:rPr>
+          <w:rFonts w:ascii="Arial" w:hAnsi="Arial" w:eastAsia="Arial"/>
+          <w:b w:val="0"/>
+          <w:color w:val="000000"/>
+          <w:sz w:val="22"/>
+        </w:rPr>
+        <w:t xml:space="preserve">. If you'd like a copy of Solid, speak with </w:t>
+      </w:r>
+      <w:r>
+        <w:rPr>
+          <w:rFonts w:ascii="Arial" w:hAnsi="Arial" w:eastAsia="Arial"/>
+          <w:b/>
+          <w:color w:val="C00000"/>
+          <w:sz w:val="22"/>
+        </w:rPr>
+        <w:t>Pastor Joy</w:t>
+      </w:r>
+      <w:r>
+        <w:rPr>
+          <w:rFonts w:ascii="Arial" w:hAnsi="Arial" w:eastAsia="Arial"/>
+          <w:b w:val="0"/>
+          <w:color w:val="000000"/>
+          <w:sz w:val="22"/>
+        </w:rPr>
+        <w:t xml:space="preserve">. Couples, we're also walking through the Solid YouVersion plan — </w:t>
+      </w:r>
+      <w:r>
+        <w:rPr>
+          <w:rFonts w:ascii="Arial" w:hAnsi="Arial" w:eastAsia="Arial"/>
+          <w:b/>
+          <w:color w:val="C00000"/>
+          <w:sz w:val="22"/>
+        </w:rPr>
+        <w:t>bible.com/reading-plans/20185</w:t>
       </w:r>
       <w:r>
         <w:rPr>

</xml_diff>